<commit_message>
Trafficker: Au Pair pausada 08/10 (1 de 7 citas), Curso Ingles sigue hasta el 15
Co-Authored-By: Claude Fable 5.1 <noreply@anthropic.com>
</commit_message>
<xml_diff>
--- a/recursos/comercial/campañas/INSTRUCCIONES_META_TRAFFICKER_2026-10-15.docx
+++ b/recursos/comercial/campañas/INSTRUCCIONES_META_TRAFFICKER_2026-10-15.docx
@@ -466,7 +466,7 @@
           <w:b w:val="0"/>
           <w:sz w:val="21"/>
         </w:rPr>
-        <w:t>• PAUSAR hoy "Curso Inglés" y "Au Pair" tal como están (tipo "más volumen" con autorrelleno: la gente envía sin leer y después no contesta).</w:t>
+        <w:t>• "Au Pair" ya quedó pausada el 08/10 (dato: de 7 citas por LaHaus, 4 vinieron de Curso Inglés, 2 de base de datos y 1 de Au Pair). "Curso Inglés" sigue al aire hasta que la campaña de WhatsApp esté activa el 15/10; ese día se pausa y la reemplaza el control con formulario "mayor intención".</w:t>
       </w:r>
     </w:p>
     <w:p>
@@ -539,7 +539,7 @@
           <w:b w:val="0"/>
           <w:sz w:val="21"/>
         </w:rPr>
-        <w:t>• La campaña separada de Au Pair se pausa: a $20.000/día no sale de aprendizaje y 3 de cada 5 leads creen que es una agencia de empleo.</w:t>
+        <w:t>• La campaña separada de Au Pair ya está pausada (08/10): a $20.000/día no salía de aprendizaje, 1 cita en 8 días y 3 de cada 5 leads creían que era una agencia de empleo. Esos $20.000/día quedan reservados para el 15/10.</w:t>
       </w:r>
     </w:p>
     <w:p>

</xml_diff>

<commit_message>
Instrucciones Meta: tabla completa de los 9 anuncios (codigo, archivo, prellenado); investigacion cadencia de contacto y Ley 2300
Co-Authored-By: Claude Fable 5.1 <noreply@anthropic.com>
</commit_message>
<xml_diff>
--- a/recursos/comercial/campañas/INSTRUCCIONES_META_TRAFFICKER_2026-10-15.docx
+++ b/recursos/comercial/campañas/INSTRUCCIONES_META_TRAFFICKER_2026-10-15.docx
@@ -442,6 +442,630 @@
           <w:sz w:val="19"/>
         </w:rPr>
         <w:t>Nada de precio ni de "quiero información" en el prellenado: el agente necesita un motivo para arrancar la conversación.</w:t>
+      </w:r>
+    </w:p>
+    <w:p>
+      <w:pPr>
+        <w:spacing w:before="200" w:after="80"/>
+      </w:pPr>
+      <w:r>
+        <w:rPr>
+          <w:b/>
+          <w:color w:val="E54C09"/>
+          <w:sz w:val="26"/>
+        </w:rPr>
+        <w:t>2-bis. Los 9 anuncios: código, archivo y mensaje prellenado (tabla completa)</w:t>
+      </w:r>
+    </w:p>
+    <w:tbl>
+      <w:tblPr>
+        <w:tblStyle w:val="TableGrid"/>
+        <w:tblW w:type="auto" w:w="0"/>
+        <w:tblLook w:firstColumn="1" w:firstRow="1" w:lastColumn="0" w:lastRow="0" w:noHBand="0" w:noVBand="1" w:val="04A0"/>
+      </w:tblPr>
+      <w:tblGrid>
+        <w:gridCol w:w="2460"/>
+        <w:gridCol w:w="2460"/>
+        <w:gridCol w:w="2460"/>
+        <w:gridCol w:w="2460"/>
+      </w:tblGrid>
+      <w:tr>
+        <w:tc>
+          <w:tcPr>
+            <w:tcW w:type="dxa" w:w="2460"/>
+          </w:tcPr>
+          <w:p>
+            <w:r>
+              <w:rPr>
+                <w:b/>
+                <w:sz w:val="18"/>
+              </w:rPr>
+              <w:t>Código (nombre del anuncio)</w:t>
+            </w:r>
+          </w:p>
+        </w:tc>
+        <w:tc>
+          <w:tcPr>
+            <w:tcW w:type="dxa" w:w="2460"/>
+          </w:tcPr>
+          <w:p>
+            <w:r>
+              <w:rPr>
+                <w:b/>
+                <w:sz w:val="18"/>
+              </w:rPr>
+              <w:t>Guion</w:t>
+            </w:r>
+          </w:p>
+        </w:tc>
+        <w:tc>
+          <w:tcPr>
+            <w:tcW w:type="dxa" w:w="2460"/>
+          </w:tcPr>
+          <w:p>
+            <w:r>
+              <w:rPr>
+                <w:b/>
+                <w:sz w:val="18"/>
+              </w:rPr>
+              <w:t>Archivo 30 s</w:t>
+            </w:r>
+          </w:p>
+        </w:tc>
+        <w:tc>
+          <w:tcPr>
+            <w:tcW w:type="dxa" w:w="2460"/>
+          </w:tcPr>
+          <w:p>
+            <w:r>
+              <w:rPr>
+                <w:b/>
+                <w:sz w:val="18"/>
+              </w:rPr>
+              <w:t>Mensaje prellenado del botón de WhatsApp</w:t>
+            </w:r>
+          </w:p>
+        </w:tc>
+      </w:tr>
+      <w:tr>
+        <w:tc>
+          <w:tcPr>
+            <w:tcW w:type="dxa" w:w="2460"/>
+          </w:tcPr>
+          <w:p>
+            <w:r>
+              <w:rPr>
+                <w:b/>
+                <w:sz w:val="18"/>
+              </w:rPr>
+              <w:t>V1_VIDEODEHOY</w:t>
+            </w:r>
+          </w:p>
+        </w:tc>
+        <w:tc>
+          <w:tcPr>
+            <w:tcW w:type="dxa" w:w="2460"/>
+          </w:tcPr>
+          <w:p>
+            <w:r>
+              <w:rPr>
+                <w:b w:val="0"/>
+                <w:sz w:val="18"/>
+              </w:rPr>
+              <w:t>Llegué Sin Una Palabra</w:t>
+            </w:r>
+          </w:p>
+        </w:tc>
+        <w:tc>
+          <w:tcPr>
+            <w:tcW w:type="dxa" w:w="2460"/>
+          </w:tcPr>
+          <w:p>
+            <w:r>
+              <w:rPr>
+                <w:b w:val="0"/>
+                <w:sz w:val="18"/>
+              </w:rPr>
+              <w:t>V1_VIDEODEHOY_A_30s.mp4</w:t>
+            </w:r>
+          </w:p>
+        </w:tc>
+        <w:tc>
+          <w:tcPr>
+            <w:tcW w:type="dxa" w:w="2460"/>
+          </w:tcPr>
+          <w:p>
+            <w:r>
+              <w:rPr>
+                <w:b w:val="0"/>
+                <w:sz w:val="18"/>
+              </w:rPr>
+              <w:t>Hola, vi el video del antes y después (V1). Quiero saber más.</w:t>
+            </w:r>
+          </w:p>
+        </w:tc>
+      </w:tr>
+      <w:tr>
+        <w:tc>
+          <w:tcPr>
+            <w:tcW w:type="dxa" w:w="2460"/>
+          </w:tcPr>
+          <w:p>
+            <w:r>
+              <w:rPr>
+                <w:b/>
+                <w:sz w:val="18"/>
+              </w:rPr>
+              <w:t>V2_CLASE</w:t>
+            </w:r>
+          </w:p>
+        </w:tc>
+        <w:tc>
+          <w:tcPr>
+            <w:tcW w:type="dxa" w:w="2460"/>
+          </w:tcPr>
+          <w:p>
+            <w:r>
+              <w:rPr>
+                <w:b w:val="0"/>
+                <w:sz w:val="18"/>
+              </w:rPr>
+              <w:t>Esto Es Una Clase</w:t>
+            </w:r>
+          </w:p>
+        </w:tc>
+        <w:tc>
+          <w:tcPr>
+            <w:tcW w:type="dxa" w:w="2460"/>
+          </w:tcPr>
+          <w:p>
+            <w:r>
+              <w:rPr>
+                <w:b w:val="0"/>
+                <w:sz w:val="18"/>
+              </w:rPr>
+              <w:t>V2_CLASE_30s.mp4</w:t>
+            </w:r>
+          </w:p>
+        </w:tc>
+        <w:tc>
+          <w:tcPr>
+            <w:tcW w:type="dxa" w:w="2460"/>
+          </w:tcPr>
+          <w:p>
+            <w:r>
+              <w:rPr>
+                <w:b w:val="0"/>
+                <w:sz w:val="18"/>
+              </w:rPr>
+              <w:t>Hola, vi el video de la clase (V2). Quiero ver una por dentro.</w:t>
+            </w:r>
+          </w:p>
+        </w:tc>
+      </w:tr>
+      <w:tr>
+        <w:tc>
+          <w:tcPr>
+            <w:tcW w:type="dxa" w:w="2460"/>
+          </w:tcPr>
+          <w:p>
+            <w:r>
+              <w:rPr>
+                <w:b/>
+                <w:sz w:val="18"/>
+              </w:rPr>
+              <w:t>V3_575H</w:t>
+            </w:r>
+          </w:p>
+        </w:tc>
+        <w:tc>
+          <w:tcPr>
+            <w:tcW w:type="dxa" w:w="2460"/>
+          </w:tcPr>
+          <w:p>
+            <w:r>
+              <w:rPr>
+                <w:b w:val="0"/>
+                <w:sz w:val="18"/>
+              </w:rPr>
+              <w:t>Siete Meses</w:t>
+            </w:r>
+          </w:p>
+        </w:tc>
+        <w:tc>
+          <w:tcPr>
+            <w:tcW w:type="dxa" w:w="2460"/>
+          </w:tcPr>
+          <w:p>
+            <w:r>
+              <w:rPr>
+                <w:b w:val="0"/>
+                <w:sz w:val="18"/>
+              </w:rPr>
+              <w:t>V3_575H_30s.mp4</w:t>
+            </w:r>
+          </w:p>
+        </w:tc>
+        <w:tc>
+          <w:tcPr>
+            <w:tcW w:type="dxa" w:w="2460"/>
+          </w:tcPr>
+          <w:p>
+            <w:r>
+              <w:rPr>
+                <w:b w:val="0"/>
+                <w:sz w:val="18"/>
+              </w:rPr>
+              <w:t>Hola, vi el video de los 7 meses (V3). ¿Qué jornada me sirve?</w:t>
+            </w:r>
+          </w:p>
+        </w:tc>
+      </w:tr>
+      <w:tr>
+        <w:tc>
+          <w:tcPr>
+            <w:tcW w:type="dxa" w:w="2460"/>
+          </w:tcPr>
+          <w:p>
+            <w:r>
+              <w:rPr>
+                <w:b/>
+                <w:sz w:val="18"/>
+              </w:rPr>
+              <w:t>V4_VACANTE</w:t>
+            </w:r>
+          </w:p>
+        </w:tc>
+        <w:tc>
+          <w:tcPr>
+            <w:tcW w:type="dxa" w:w="2460"/>
+          </w:tcPr>
+          <w:p>
+            <w:r>
+              <w:rPr>
+                <w:b w:val="0"/>
+                <w:sz w:val="18"/>
+              </w:rPr>
+              <w:t>La Vacante</w:t>
+            </w:r>
+          </w:p>
+        </w:tc>
+        <w:tc>
+          <w:tcPr>
+            <w:tcW w:type="dxa" w:w="2460"/>
+          </w:tcPr>
+          <w:p>
+            <w:r>
+              <w:rPr>
+                <w:b w:val="0"/>
+                <w:sz w:val="18"/>
+              </w:rPr>
+              <w:t>V4_VACANTE_30s.mp4</w:t>
+            </w:r>
+          </w:p>
+        </w:tc>
+        <w:tc>
+          <w:tcPr>
+            <w:tcW w:type="dxa" w:w="2460"/>
+          </w:tcPr>
+          <w:p>
+            <w:r>
+              <w:rPr>
+                <w:b w:val="0"/>
+                <w:sz w:val="18"/>
+              </w:rPr>
+              <w:t>Hola, vi el video de la vacante (V4). Necesito el inglés para el trabajo.</w:t>
+            </w:r>
+          </w:p>
+        </w:tc>
+      </w:tr>
+      <w:tr>
+        <w:tc>
+          <w:tcPr>
+            <w:tcW w:type="dxa" w:w="2460"/>
+          </w:tcPr>
+          <w:p>
+            <w:r>
+              <w:rPr>
+                <w:b/>
+                <w:sz w:val="18"/>
+              </w:rPr>
+              <w:t>V5_PASAPORTE</w:t>
+            </w:r>
+          </w:p>
+        </w:tc>
+        <w:tc>
+          <w:tcPr>
+            <w:tcW w:type="dxa" w:w="2460"/>
+          </w:tcPr>
+          <w:p>
+            <w:r>
+              <w:rPr>
+                <w:b w:val="0"/>
+                <w:sz w:val="18"/>
+              </w:rPr>
+              <w:t>El Pasaporte</w:t>
+            </w:r>
+          </w:p>
+        </w:tc>
+        <w:tc>
+          <w:tcPr>
+            <w:tcW w:type="dxa" w:w="2460"/>
+          </w:tcPr>
+          <w:p>
+            <w:r>
+              <w:rPr>
+                <w:b w:val="0"/>
+                <w:sz w:val="18"/>
+              </w:rPr>
+              <w:t>V5_PASAPORTE_30s.mp4</w:t>
+            </w:r>
+          </w:p>
+        </w:tc>
+        <w:tc>
+          <w:tcPr>
+            <w:tcW w:type="dxa" w:w="2460"/>
+          </w:tcPr>
+          <w:p>
+            <w:r>
+              <w:rPr>
+                <w:b w:val="0"/>
+                <w:sz w:val="18"/>
+              </w:rPr>
+              <w:t>Hola, quiero prepararme en inglés para Au Pair / irme (V5).</w:t>
+            </w:r>
+          </w:p>
+        </w:tc>
+      </w:tr>
+      <w:tr>
+        <w:tc>
+          <w:tcPr>
+            <w:tcW w:type="dxa" w:w="2460"/>
+          </w:tcPr>
+          <w:p>
+            <w:r>
+              <w:rPr>
+                <w:b/>
+                <w:sz w:val="18"/>
+              </w:rPr>
+              <w:t>V6_GARANTIA</w:t>
+            </w:r>
+          </w:p>
+        </w:tc>
+        <w:tc>
+          <w:tcPr>
+            <w:tcW w:type="dxa" w:w="2460"/>
+          </w:tcPr>
+          <w:p>
+            <w:r>
+              <w:rPr>
+                <w:b w:val="0"/>
+                <w:sz w:val="18"/>
+              </w:rPr>
+              <w:t>Te Acompañamos (Y Te Lo Firmamos)</w:t>
+            </w:r>
+          </w:p>
+        </w:tc>
+        <w:tc>
+          <w:tcPr>
+            <w:tcW w:type="dxa" w:w="2460"/>
+          </w:tcPr>
+          <w:p>
+            <w:r>
+              <w:rPr>
+                <w:b w:val="0"/>
+                <w:sz w:val="18"/>
+              </w:rPr>
+              <w:t>V6_GARANTIA_30s.mp4</w:t>
+            </w:r>
+          </w:p>
+        </w:tc>
+        <w:tc>
+          <w:tcPr>
+            <w:tcW w:type="dxa" w:w="2460"/>
+          </w:tcPr>
+          <w:p>
+            <w:r>
+              <w:rPr>
+                <w:b w:val="0"/>
+                <w:sz w:val="18"/>
+              </w:rPr>
+              <w:t>Hola, vi el video del acompañamiento (V6). ¿Me muestran la garantía?</w:t>
+            </w:r>
+          </w:p>
+        </w:tc>
+      </w:tr>
+      <w:tr>
+        <w:tc>
+          <w:tcPr>
+            <w:tcW w:type="dxa" w:w="2460"/>
+          </w:tcPr>
+          <w:p>
+            <w:r>
+              <w:rPr>
+                <w:b/>
+                <w:sz w:val="18"/>
+              </w:rPr>
+              <w:t>V7_NOESFACIL</w:t>
+            </w:r>
+          </w:p>
+        </w:tc>
+        <w:tc>
+          <w:tcPr>
+            <w:tcW w:type="dxa" w:w="2460"/>
+          </w:tcPr>
+          <w:p>
+            <w:r>
+              <w:rPr>
+                <w:b w:val="0"/>
+                <w:sz w:val="18"/>
+              </w:rPr>
+              <w:t>El Pacto</w:t>
+            </w:r>
+          </w:p>
+        </w:tc>
+        <w:tc>
+          <w:tcPr>
+            <w:tcW w:type="dxa" w:w="2460"/>
+          </w:tcPr>
+          <w:p>
+            <w:r>
+              <w:rPr>
+                <w:b w:val="0"/>
+                <w:sz w:val="18"/>
+              </w:rPr>
+              <w:t>V7_NOESFACIL_30s.mp4</w:t>
+            </w:r>
+          </w:p>
+        </w:tc>
+        <w:tc>
+          <w:tcPr>
+            <w:tcW w:type="dxa" w:w="2460"/>
+          </w:tcPr>
+          <w:p>
+            <w:r>
+              <w:rPr>
+                <w:b w:val="0"/>
+                <w:sz w:val="18"/>
+              </w:rPr>
+              <w:t>Hola, vi el video de lo que no prometen (V7). Voy en serio.</w:t>
+            </w:r>
+          </w:p>
+        </w:tc>
+      </w:tr>
+      <w:tr>
+        <w:tc>
+          <w:tcPr>
+            <w:tcW w:type="dxa" w:w="2460"/>
+          </w:tcPr>
+          <w:p>
+            <w:r>
+              <w:rPr>
+                <w:b/>
+                <w:sz w:val="18"/>
+              </w:rPr>
+              <w:t>V8_PADRES</w:t>
+            </w:r>
+          </w:p>
+        </w:tc>
+        <w:tc>
+          <w:tcPr>
+            <w:tcW w:type="dxa" w:w="2460"/>
+          </w:tcPr>
+          <w:p>
+            <w:r>
+              <w:rPr>
+                <w:b w:val="0"/>
+                <w:sz w:val="18"/>
+              </w:rPr>
+              <w:t>El Año Después Del Colegio</w:t>
+            </w:r>
+          </w:p>
+        </w:tc>
+        <w:tc>
+          <w:tcPr>
+            <w:tcW w:type="dxa" w:w="2460"/>
+          </w:tcPr>
+          <w:p>
+            <w:r>
+              <w:rPr>
+                <w:b w:val="0"/>
+                <w:sz w:val="18"/>
+              </w:rPr>
+              <w:t>V8_PADRES_30s.mp4</w:t>
+            </w:r>
+          </w:p>
+        </w:tc>
+        <w:tc>
+          <w:tcPr>
+            <w:tcW w:type="dxa" w:w="2460"/>
+          </w:tcPr>
+          <w:p>
+            <w:r>
+              <w:rPr>
+                <w:b w:val="0"/>
+                <w:sz w:val="18"/>
+              </w:rPr>
+              <w:t>Hola, vi el video del año después del colegio (V8). Es para mi hijo/a.</w:t>
+            </w:r>
+          </w:p>
+        </w:tc>
+      </w:tr>
+      <w:tr>
+        <w:tc>
+          <w:tcPr>
+            <w:tcW w:type="dxa" w:w="2460"/>
+          </w:tcPr>
+          <w:p>
+            <w:r>
+              <w:rPr>
+                <w:b/>
+                <w:sz w:val="18"/>
+              </w:rPr>
+              <w:t>V9_CORRECCION</w:t>
+            </w:r>
+          </w:p>
+        </w:tc>
+        <w:tc>
+          <w:tcPr>
+            <w:tcW w:type="dxa" w:w="2460"/>
+          </w:tcPr>
+          <w:p>
+            <w:r>
+              <w:rPr>
+                <w:b w:val="0"/>
+                <w:sz w:val="18"/>
+              </w:rPr>
+              <w:t>La Corrección Del Día</w:t>
+            </w:r>
+          </w:p>
+        </w:tc>
+        <w:tc>
+          <w:tcPr>
+            <w:tcW w:type="dxa" w:w="2460"/>
+          </w:tcPr>
+          <w:p>
+            <w:r>
+              <w:rPr>
+                <w:b w:val="0"/>
+                <w:sz w:val="18"/>
+              </w:rPr>
+              <w:t>V9_CORRECCION_30s.mp4</w:t>
+            </w:r>
+          </w:p>
+        </w:tc>
+        <w:tc>
+          <w:tcPr>
+            <w:tcW w:type="dxa" w:w="2460"/>
+          </w:tcPr>
+          <w:p>
+            <w:r>
+              <w:rPr>
+                <w:b w:val="0"/>
+                <w:sz w:val="18"/>
+              </w:rPr>
+              <w:t>Hola, vi la corrección del día (V9). Aquí va mi audio.</w:t>
+            </w:r>
+          </w:p>
+        </w:tc>
+      </w:tr>
+    </w:tbl>
+    <w:p>
+      <w:pPr>
+        <w:spacing w:after="40"/>
+      </w:pPr>
+    </w:p>
+    <w:p>
+      <w:pPr>
+        <w:spacing w:after="80"/>
+      </w:pPr>
+      <w:r>
+        <w:rPr>
+          <w:b w:val="0"/>
+          <w:color w:val="666666"/>
+          <w:sz w:val="19"/>
+        </w:rPr>
+        <w:t>Recibidos a 13/10: V1 (A), V3 y V4 (y V6, que se regraba por un cambio de palabra). El resto llega el miércoles 14. Si el jueves no están los 9, se lanza con los que haya y los que falten entran en el corte del 22/10.</w:t>
       </w:r>
     </w:p>
     <w:p>

</xml_diff>

<commit_message>
Instrucciones Brian regeneradas (5 secciones)
Co-Authored-By: Claude Fable 5.1 <noreply@anthropic.com>
</commit_message>
<xml_diff>
--- a/recursos/comercial/campañas/INSTRUCCIONES_META_TRAFFICKER_2026-10-15.docx
+++ b/recursos/comercial/campañas/INSTRUCCIONES_META_TRAFFICKER_2026-10-15.docx
@@ -22,7 +22,7 @@
           <w:color w:val="666666"/>
           <w:sz w:val="19"/>
         </w:rPr>
-        <w:t>Para el trafficker. Basado en documentación oficial de Meta y evidencia publicada (investigación interna 08/10/2026). Presupuesto total: $70.000/día. La campaña de WhatsApp ya está al aire desde el 13/10 (el anuncio de "Curso Inglés" pasó de formulario a WhatsApp). El jueves 15 NO se crea otra campaña: los 3 videos que ya están (V1, V3, V4) entran como anuncios nuevos en ESE conjunto; los demás, en el corte del 22/10 (ver sección 7). Objetivo del periodo: saber cuál de los videos nuevos trae citas más baratas, y dejar de perder leads de formulario que no contestan.</w:t>
+        <w:t>Para el trafficker. Basado en documentación oficial de Meta y evidencia publicada (investigación interna 08/10/2026). Presupuesto total: $70.000/día. La campaña de WhatsApp ya está al aire desde el 13/10 (el anuncio de "Curso Inglés" pasó de formulario a WhatsApp). El jueves 15 NO se crea otra campaña: los 3 videos que ya están (V1, V3, V4) entran como anuncios nuevos en ESE conjunto; los demás, en el corte del 22/10 (ver sección 5). Objetivo del periodo: saber cuál de los videos nuevos trae citas más baratas, y dejar de perder leads de formulario que no contestan.</w:t>
       </w:r>
     </w:p>
     <w:p>
@@ -741,7 +741,7 @@
           <w:color w:val="E54C09"/>
           <w:sz w:val="26"/>
         </w:rPr>
-        <w:t>4. Au Pair — PRIORIDAD (es el servicio que más engancha; V5 es el primer video que debe llegar el miércoles)</w:t>
+        <w:t>4. Au Pair (prioridad: es el servicio que más engancha)</w:t>
       </w:r>
     </w:p>
     <w:p>
@@ -765,7 +765,7 @@
           <w:b w:val="0"/>
           <w:sz w:val="21"/>
         </w:rPr>
-        <w:t>• Vuelve como UN anuncio (V5_PASAPORTE) dentro del conjunto de WhatsApp, SOLO cuando llegue el video (corte del 22/10); mientras tanto no se crea nada de Au Pair. Primera línea del texto del anuncio: "No somos agencia: te preparamos en inglés para la entrevista de Au Pair o de trabajo en el exterior. El trámite lo haces con la agencia que elijas."</w:t>
+        <w:t>• Vuelve como UN anuncio (V5_PASAPORTE) dentro del conjunto de WhatsApp cuando llegue el video. Si en la entrega del miércoles se puede priorizar V5, nos sirve mucho: es el servicio que más engancha. Mientras tanto no se crea nada de Au Pair. Primera línea del texto del anuncio: "No somos agencia: te preparamos en inglés para la entrevista de Au Pair o de trabajo en el exterior. El trámite lo haces con la agencia que elijas."</w:t>
       </w:r>
     </w:p>
     <w:p>
@@ -802,93 +802,7 @@
           <w:color w:val="E54C09"/>
           <w:sz w:val="26"/>
         </w:rPr>
-        <w:t>5. Medición y cortes</w:t>
-      </w:r>
-    </w:p>
-    <w:p>
-      <w:pPr>
-        <w:spacing w:after="40"/>
-      </w:pPr>
-      <w:r>
-        <w:rPr>
-          <w:b w:val="0"/>
-          <w:sz w:val="21"/>
-        </w:rPr>
-        <w:t>• Hoja diaria (coordinación comercial): fecha · código V# · conversación sí/no · cita agendada · cita atendida. Costo por cita de un video = gasto de ese anuncio (desglose por anuncio) ÷ citas con su código.</w:t>
-      </w:r>
-    </w:p>
-    <w:p>
-      <w:pPr>
-        <w:spacing w:after="40"/>
-      </w:pPr>
-      <w:r>
-        <w:rPr>
-          <w:b w:val="0"/>
-          <w:sz w:val="21"/>
-        </w:rPr>
-        <w:t>• Lectura temprana de creativos (tienen más volumen que las citas): tasa de gancho = reproducciones de 3 s ÷ impresiones · reproducciones completas (ThruPlay) · CTR · costo por conversación iniciada.</w:t>
-      </w:r>
-    </w:p>
-    <w:p>
-      <w:pPr>
-        <w:spacing w:after="40"/>
-      </w:pPr>
-      <w:r>
-        <w:rPr>
-          <w:b w:val="0"/>
-          <w:sz w:val="21"/>
-        </w:rPr>
-        <w:t>• Primer corte: 22/10. Cierre: 31/10. No se apaga un video antes del 22 y no se declara ganador ninguno con menos de 5 citas.</w:t>
-      </w:r>
-    </w:p>
-    <w:p>
-      <w:pPr>
-        <w:spacing w:after="40"/>
-      </w:pPr>
-      <w:r>
-        <w:rPr>
-          <w:b w:val="0"/>
-          <w:sz w:val="21"/>
-        </w:rPr>
-        <w:t>• No editar el conjunto a diario (cada edición reinicia el aprendizaje). Cambios solo en los cortes.</w:t>
-      </w:r>
-    </w:p>
-    <w:p>
-      <w:pPr>
-        <w:spacing w:before="200" w:after="80"/>
-      </w:pPr>
-      <w:r>
-        <w:rPr>
-          <w:b/>
-          <w:color w:val="E54C09"/>
-          <w:sz w:val="26"/>
-        </w:rPr>
-        <w:t>6. Lo que NO se hace</w:t>
-      </w:r>
-    </w:p>
-    <w:p>
-      <w:pPr>
-        <w:spacing w:after="40"/>
-      </w:pPr>
-      <w:r>
-        <w:rPr>
-          <w:b w:val="0"/>
-          <w:sz w:val="21"/>
-        </w:rPr>
-        <w:t>Objetivo Tráfico para WhatsApp · un conjunto por video · formulario "más volumen" con autorrelleno · prometer empleo/visa/"garantizado en X meses" · retargeting con menos de ~1.000 personas · comparar costo por lead con benchmarks de EE. UU. o de blogs sin muestra (el nuestro es ~$10.800 por lead de formulario) · declarar ganador con menos de 5 citas · videos con avatares de IA (sin evidencia y contra la prueba real).</w:t>
-      </w:r>
-    </w:p>
-    <w:p>
-      <w:pPr>
-        <w:spacing w:before="200" w:after="80"/>
-      </w:pPr>
-      <w:r>
-        <w:rPr>
-          <w:b/>
-          <w:color w:val="E54C09"/>
-          <w:sz w:val="26"/>
-        </w:rPr>
-        <w:t>7. Lo que falta y cuándo entra (para que no se pierda de vista)</w:t>
+        <w:t>5. Lo que falta y cuándo entra</w:t>
       </w:r>
     </w:p>
     <w:tbl>
@@ -1102,7 +1016,7 @@
                 <w:b w:val="0"/>
                 <w:sz w:val="18"/>
               </w:rPr>
-              <w:t>El pasaporte (Au Pair / irse) — PRIORIDAD</w:t>
+              <w:t>El pasaporte (Au Pair / irse) — el que más nos sirve primero</w:t>
             </w:r>
           </w:p>
         </w:tc>
@@ -1116,7 +1030,7 @@
                 <w:b w:val="0"/>
                 <w:sz w:val="18"/>
               </w:rPr>
-              <w:t>Falta (30 s): es el primero que debe llegar el miércoles</w:t>
+              <w:t>Falta (30 s)</w:t>
             </w:r>
           </w:p>
         </w:tc>
@@ -1384,19 +1298,6 @@
           <w:sz w:val="19"/>
         </w:rPr>
         <w:t>Prellenados de estos anuncios: V2 "Hola, vi el video de la clase (V2). Quiero ver una por dentro." · V5 "Hola, quiero prepararme en inglés para Au Pair / irme (V5)." · V6 "Hola, vi el video del acompañamiento (V6). ¿Me muestran la garantía?" · V7 "Hola, vi el video de lo que no prometen (V7). Voy en serio." · V8 "Hola, vi el video del año después del colegio (V8). Es para mi hijo/a." · V9 "Hola, vi la corrección del día (V9). Aquí va mi audio."</w:t>
-      </w:r>
-    </w:p>
-    <w:p>
-      <w:pPr>
-        <w:spacing w:after="80"/>
-      </w:pPr>
-      <w:r>
-        <w:rPr>
-          <w:b w:val="0"/>
-          <w:color w:val="666666"/>
-          <w:sz w:val="19"/>
-        </w:rPr>
-        <w:t>Regla: los videos que lleguen entre el 15 y el 21 NO se agregan al conjunto activo (reinicia el aprendizaje). Entran todos juntos en el corte del 22/10.</w:t>
       </w:r>
     </w:p>
     <w:sectPr>

</xml_diff>

<commit_message>
Instrucciones Brian: correcciones de Diana (enlace para LaHaus, agencia aliada, sin politicas que el ya conoce)
Co-Authored-By: Claude Fable 5.1 <noreply@anthropic.com>
</commit_message>
<xml_diff>
--- a/recursos/comercial/campañas/INSTRUCCIONES_META_TRAFFICKER_2026-10-15.docx
+++ b/recursos/comercial/campañas/INSTRUCCIONES_META_TRAFFICKER_2026-10-15.docx
@@ -668,7 +668,7 @@
           <w:b w:val="0"/>
           <w:sz w:val="21"/>
         </w:rPr>
-        <w:t>• "Au Pair" quedó pausada el 08/10 (de 7 citas por LaHaus, 4 vinieron de Curso Inglés, 2 de base de datos y 1 de Au Pair). "Curso Inglés" como formulario se pausó el 13/10 y ese mismo anuncio pasó a WhatsApp (es el conjunto de la sección 1). No se vuelve a prender el formulario viejo.</w:t>
+        <w:t>• "Au Pair" quedó pausada el 08/10 (de 7 citas por LaHaus, 4 vinieron de Curso Inglés, 2 de base de datos y 1 de Au Pair). "Curso Inglés" como formulario se pausó el 13/10 y ese mismo anuncio pasó a WhatsApp (es el conjunto de la sección 1). No se vuelve a prender el formulario viejo. Cuando los anuncios nuevos estén adjuntos a la campaña, Brian nos pasa el enlace y el ID de la campaña y de cada anuncio, para dárselos a LaHaus.</w:t>
       </w:r>
     </w:p>
     <w:p>
@@ -765,31 +765,7 @@
           <w:b w:val="0"/>
           <w:sz w:val="21"/>
         </w:rPr>
-        <w:t>• Vuelve como UN anuncio (V5_PASAPORTE) dentro del conjunto de WhatsApp cuando llegue el video. Si en la entrega del miércoles se puede priorizar V5, nos sirve mucho: es el servicio que más engancha. Mientras tanto no se crea nada de Au Pair. Primera línea del texto del anuncio: "No somos agencia: te preparamos en inglés para la entrevista de Au Pair o de trabajo en el exterior. El trámite lo haces con la agencia que elijas."</w:t>
-      </w:r>
-    </w:p>
-    <w:p>
-      <w:pPr>
-        <w:spacing w:after="40"/>
-      </w:pPr>
-      <w:r>
-        <w:rPr>
-          <w:b w:val="0"/>
-          <w:sz w:val="21"/>
-        </w:rPr>
-        <w:t>• Prohibido por política de Meta (resultados irreales): prometer empleo, visa, familia anfitriona o salario. Solo preparación.</w:t>
-      </w:r>
-    </w:p>
-    <w:p>
-      <w:pPr>
-        <w:spacing w:after="40"/>
-      </w:pPr>
-      <w:r>
-        <w:rPr>
-          <w:b w:val="0"/>
-          <w:sz w:val="21"/>
-        </w:rPr>
-        <w:t>• La categoría especial "Empleo" no es obligatoria para audiencia en Colombia; no marcarla.</w:t>
+        <w:t>• Vuelve como UN anuncio (V5_PASAPORTE) dentro del conjunto de WhatsApp cuando llegue el video. Si se puede priorizar V5, nos sirve mucho: es el servicio que más engancha. Mientras tanto no se crea nada de Au Pair. Primera línea del texto del anuncio: "No somos agencia: te preparamos en inglés para la entrevista de Au Pair o de trabajo en el exterior. El trámite lo haces con la agencia aliada en la que confiamos."</w:t>
       </w:r>
     </w:p>
     <w:p>

</xml_diff>

<commit_message>
Instrucciones Brian regeneradas (anuncios el 14)
Co-Authored-By: Claude Fable 5.1 <noreply@anthropic.com>
</commit_message>
<xml_diff>
--- a/recursos/comercial/campañas/INSTRUCCIONES_META_TRAFFICKER_2026-10-15.docx
+++ b/recursos/comercial/campañas/INSTRUCCIONES_META_TRAFFICKER_2026-10-15.docx
@@ -22,7 +22,7 @@
           <w:color w:val="666666"/>
           <w:sz w:val="19"/>
         </w:rPr>
-        <w:t>Para el trafficker. Basado en documentación oficial de Meta y evidencia publicada (investigación interna 08/10/2026). Presupuesto total: $70.000/día. La campaña de WhatsApp ya está al aire desde el 13/10 (el anuncio de "Curso Inglés" pasó de formulario a WhatsApp). El jueves 15 NO se crea otra campaña: los 3 videos que ya están (V1, V3, V4) entran como anuncios nuevos en ESE conjunto; los demás, en el corte del 22/10 (ver sección 5). Objetivo del periodo: saber cuál de los videos nuevos trae citas más baratas, y dejar de perder leads de formulario que no contestan.</w:t>
+        <w:t>Para el trafficker. Basado en documentación oficial de Meta y evidencia publicada (investigación interna 08/10/2026). Presupuesto total: $70.000/día. La campaña de WhatsApp ya está al aire desde el 13/10 (el anuncio de "Curso Inglés" pasó de formulario a WhatsApp). NO se crea otra campaña: los 3 videos que ya están (V1, V3, V4) entran como anuncios nuevos en ESE conjunto el miércoles 14 (apenas estén montados, Brian nos pasa el enlace y los ID para LaHaus); los demás, en el corte del 22/10 (ver sección 5). Objetivo del periodo: saber cuál de los videos nuevos trae citas más baratas, y dejar de perder leads de formulario que no contestan.</w:t>
       </w:r>
     </w:p>
     <w:p>
@@ -118,7 +118,7 @@
                 <w:b/>
                 <w:sz w:val="18"/>
               </w:rPr>
-              <w:t>Anuncios desde el 15/10</w:t>
+              <w:t>Anuncios desde el 14/10</w:t>
             </w:r>
           </w:p>
         </w:tc>
@@ -190,7 +190,7 @@
                 <w:b w:val="0"/>
                 <w:sz w:val="18"/>
               </w:rPr>
-              <w:t>Es el conjunto que ya corre desde el 13/10 con el anuncio de "Curso Inglés" (se deja). El jueves 15 se agregan TRES anuncios, uno por video: V1_VIDEODEHOY, V3_575H, V4_VACANTE. Los que falten se agregan SOLO en el corte del 22/10.</w:t>
+              <w:t>Es el conjunto que ya corre desde el 13/10 con el anuncio de "Curso Inglés" (se deja). El miércoles 14 se agregan TRES anuncios, uno por video: V1_VIDEODEHOY, V3_575H, V4_VACANTE. Los que falten se agregan SOLO en el corte del 22/10.</w:t>
             </w:r>
           </w:p>
         </w:tc>
@@ -262,7 +262,7 @@
                 <w:b w:val="0"/>
                 <w:sz w:val="18"/>
               </w:rPr>
-              <w:t>V3_575H y V4_VACANTE (los dos de profe). Se revisa en el corte del 22.</w:t>
+              <w:t>Se crea el miércoles 14 con V3_575H y V4_VACANTE (los dos de profe). Se revisa en el corte del 22.</w:t>
             </w:r>
           </w:p>
         </w:tc>
@@ -753,7 +753,7 @@
           <w:b w:val="0"/>
           <w:sz w:val="21"/>
         </w:rPr>
-        <w:t>• La campaña separada de Au Pair ya está pausada (08/10): a $20.000/día no salía de aprendizaje, 1 cita en 8 días y 3 de cada 5 leads creían que era una agencia de empleo. Esos $20.000/día quedan reservados para el 15/10.</w:t>
+        <w:t>• La campaña separada de Au Pair ya está pausada (08/10): a $20.000/día no salía de aprendizaje, 1 cita en 8 días y 3 de cada 5 leads creían que era una agencia de empleo. Esos $20.000/día quedan reservados para cuando entre V5.</w:t>
       </w:r>
     </w:p>
     <w:p>

</xml_diff>

<commit_message>
Instrucciones Brian: correcciones finales de Diana (enlace al grupo; texto Au Pair y prellenados van con el Word de esos videos)
Co-Authored-By: Claude Fable 5.1 <noreply@anthropic.com>
</commit_message>
<xml_diff>
--- a/recursos/comercial/campañas/INSTRUCCIONES_META_TRAFFICKER_2026-10-15.docx
+++ b/recursos/comercial/campañas/INSTRUCCIONES_META_TRAFFICKER_2026-10-15.docx
@@ -22,7 +22,7 @@
           <w:color w:val="666666"/>
           <w:sz w:val="19"/>
         </w:rPr>
-        <w:t>Para el trafficker. Basado en documentación oficial de Meta y evidencia publicada (investigación interna 08/10/2026). Presupuesto total: $70.000/día. La campaña de WhatsApp ya está al aire desde el 13/10 (el anuncio de "Curso Inglés" pasó de formulario a WhatsApp). NO se crea otra campaña: los 3 videos que ya están (V1, V3, V4) entran como anuncios nuevos en ESE conjunto el miércoles 14 (apenas estén montados, Brian nos pasa el enlace y los ID para LaHaus); los demás, en el corte del 22/10 (ver sección 5). Objetivo del periodo: saber cuál de los videos nuevos trae citas más baratas, y dejar de perder leads de formulario que no contestan.</w:t>
+        <w:t>Para el trafficker. Basado en documentación oficial de Meta y evidencia publicada (investigación interna 08/10/2026). Presupuesto total: $70.000/día. La campaña de WhatsApp ya está al aire desde el 13/10 (el anuncio de "Curso Inglés" pasó de formulario a WhatsApp). NO se crea otra campaña: los 3 videos que ya están (V1, V3, V4) entran como anuncios nuevos en ESE conjunto el miércoles 14 (apenas estén montados, compartir el enlace en el grupo); los demás, en el corte del 22/10 (ver sección 5). Objetivo del periodo: saber cuál de los videos nuevos trae citas más baratas, y dejar de perder leads de formulario que no contestan.</w:t>
       </w:r>
     </w:p>
     <w:p>
@@ -190,7 +190,7 @@
                 <w:b w:val="0"/>
                 <w:sz w:val="18"/>
               </w:rPr>
-              <w:t>Es el conjunto que ya corre desde el 13/10 con el anuncio de "Curso Inglés" (se deja). El miércoles 14 se agregan TRES anuncios, uno por video: V1_VIDEODEHOY, V3_575H, V4_VACANTE. Los que falten se agregan SOLO en el corte del 22/10.</w:t>
+              <w:t>Es el conjunto que ya corre desde el 13/10 con el anuncio de "Curso Inglés" (se deja). Agregar TRES anuncios, uno por video: V1_VIDEODEHOY, V3_575H, V4_VACANTE. Los que falten se agregan SOLO en el corte del 22/10.</w:t>
             </w:r>
           </w:p>
         </w:tc>
@@ -262,7 +262,7 @@
                 <w:b w:val="0"/>
                 <w:sz w:val="18"/>
               </w:rPr>
-              <w:t>Se crea el miércoles 14 con V3_575H y V4_VACANTE (los dos de profe). Se revisa en el corte del 22.</w:t>
+              <w:t>Crear con V3_575H y V4_VACANTE (los dos de profe). Se revisa en el corte del 22.</w:t>
             </w:r>
           </w:p>
         </w:tc>
@@ -668,7 +668,7 @@
           <w:b w:val="0"/>
           <w:sz w:val="21"/>
         </w:rPr>
-        <w:t>• "Au Pair" quedó pausada el 08/10 (de 7 citas por LaHaus, 4 vinieron de Curso Inglés, 2 de base de datos y 1 de Au Pair). "Curso Inglés" como formulario se pausó el 13/10 y ese mismo anuncio pasó a WhatsApp (es el conjunto de la sección 1). No se vuelve a prender el formulario viejo. Cuando los anuncios nuevos estén adjuntos a la campaña, Brian nos pasa el enlace y el ID de la campaña y de cada anuncio, para dárselos a LaHaus.</w:t>
+        <w:t>• "Au Pair" quedó pausada el 08/10 (de 7 citas por LaHaus, 4 vinieron de Curso Inglés, 2 de base de datos y 1 de Au Pair). "Curso Inglés" como formulario se pausó el 13/10 y ese mismo anuncio pasó a WhatsApp (es el conjunto de la sección 1). No se vuelve a prender el formulario viejo. Cuando los anuncios nuevos estén adjuntos a la campaña, compartir el enlace en el grupo, por favor.</w:t>
       </w:r>
     </w:p>
     <w:p>
@@ -765,7 +765,7 @@
           <w:b w:val="0"/>
           <w:sz w:val="21"/>
         </w:rPr>
-        <w:t>• Vuelve como UN anuncio (V5_PASAPORTE) dentro del conjunto de WhatsApp cuando llegue el video. Si se puede priorizar V5, nos sirve mucho: es el servicio que más engancha. Mientras tanto no se crea nada de Au Pair. Primera línea del texto del anuncio: "No somos agencia: te preparamos en inglés para la entrevista de Au Pair o de trabajo en el exterior. El trámite lo haces con la agencia aliada en la que confiamos."</w:t>
+        <w:t>• Vuelve como UN anuncio (V5_PASAPORTE) dentro del conjunto de WhatsApp cuando llegue el video. Si se puede priorizar V5, nos sirve mucho: es el servicio que más engancha. Mientras tanto no se crea nada de Au Pair; el texto del anuncio llega con el Word de esos videos.</w:t>
       </w:r>
     </w:p>
     <w:p>
@@ -1273,7 +1273,7 @@
           <w:color w:val="666666"/>
           <w:sz w:val="19"/>
         </w:rPr>
-        <w:t>Prellenados de estos anuncios: V2 "Hola, vi el video de la clase (V2). Quiero ver una por dentro." · V5 "Hola, quiero prepararme en inglés para Au Pair / irme (V5)." · V6 "Hola, vi el video del acompañamiento (V6). ¿Me muestran la garantía?" · V7 "Hola, vi el video de lo que no prometen (V7). Voy en serio." · V8 "Hola, vi el video del año después del colegio (V8). Es para mi hijo/a." · V9 "Hola, vi la corrección del día (V9). Aquí va mi audio."</w:t>
+        <w:t>Los códigos y prellenados de estos anuncios llegan con el Word de esos videos.</w:t>
       </w:r>
     </w:p>
     <w:sectPr>

</xml_diff>